<commit_message>
epitirites 2026 june draft
</commit_message>
<xml_diff>
--- a/files/timetables/Προγραμμα_Μαθηματων_Εαρινό_2025-2026-final.docx
+++ b/files/timetables/Προγραμμα_Μαθηματων_Εαρινό_2025-2026-final.docx
@@ -5421,6 +5421,9 @@
             <w:pPr>
               <w:jc w:val="center"/>
               <w:cnfStyle w:val="000000100000" w:firstRow="0" w:lastRow="0" w:firstColumn="0" w:lastColumn="0" w:oddVBand="0" w:evenVBand="0" w:oddHBand="1" w:evenHBand="0" w:firstRowFirstColumn="0" w:firstRowLastColumn="0" w:lastRowFirstColumn="0" w:lastRowLastColumn="0"/>
+              <w:rPr>
+                <w:lang w:val="el-GR"/>
+              </w:rPr>
             </w:pPr>
           </w:p>
         </w:tc>
@@ -6852,23 +6855,7 @@
                 <w:sz w:val="16"/>
                 <w:lang w:val="el-GR"/>
               </w:rPr>
-              <w:t>-</w:t>
-            </w:r>
-            <w:r>
-              <w:rPr>
-                <w:rFonts w:ascii="Calibri" w:hAnsi="Calibri"/>
-                <w:sz w:val="16"/>
-                <w:lang w:val="el-GR"/>
-              </w:rPr>
-              <w:t xml:space="preserve"> Θ</w:t>
-            </w:r>
-            <w:r>
-              <w:rPr>
-                <w:rFonts w:ascii="Calibri" w:hAnsi="Calibri"/>
-                <w:sz w:val="16"/>
-                <w:lang w:val="el-GR"/>
-              </w:rPr>
-              <w:t xml:space="preserve"> </w:t>
+              <w:t xml:space="preserve">- Θ </w:t>
             </w:r>
             <w:proofErr w:type="spellStart"/>
             <w:r>
@@ -7314,6 +7301,7 @@
             <w:tcW w:w="3881" w:type="dxa"/>
             <w:gridSpan w:val="3"/>
             <w:vMerge/>
+            <w:shd w:val="clear" w:color="auto" w:fill="E7EFF7"/>
           </w:tcPr>
           <w:p>
             <w:pPr>
@@ -7447,6 +7435,7 @@
             <w:tcW w:w="3881" w:type="dxa"/>
             <w:gridSpan w:val="3"/>
             <w:vMerge/>
+            <w:shd w:val="clear" w:color="auto" w:fill="E7EFF7"/>
           </w:tcPr>
           <w:p>
             <w:pPr>
@@ -7677,12 +7666,60 @@
           <w:tcPr>
             <w:tcW w:w="3881" w:type="dxa"/>
             <w:gridSpan w:val="3"/>
-            <w:vMerge/>
-          </w:tcPr>
-          <w:p>
-            <w:pPr>
+            <w:shd w:val="clear" w:color="auto" w:fill="E7EFF7"/>
+          </w:tcPr>
+          <w:p>
+            <w:pPr>
+              <w:jc w:val="center"/>
               <w:cnfStyle w:val="000000100000" w:firstRow="0" w:lastRow="0" w:firstColumn="0" w:lastColumn="0" w:oddVBand="0" w:evenVBand="0" w:oddHBand="1" w:evenHBand="0" w:firstRowFirstColumn="0" w:firstRowLastColumn="0" w:lastRowFirstColumn="0" w:lastRowLastColumn="0"/>
-            </w:pPr>
+              <w:rPr>
+                <w:lang w:val="el-GR"/>
+              </w:rPr>
+            </w:pPr>
+            <w:r>
+              <w:rPr>
+                <w:rFonts w:ascii="Calibri" w:hAnsi="Calibri"/>
+                <w:sz w:val="16"/>
+                <w:lang w:val="el-GR"/>
+              </w:rPr>
+              <w:t xml:space="preserve">Εγγειοβελτιωτικά Έργα – Αρδεύσεις (ΥΥ. ΓΕ) - </w:t>
+            </w:r>
+            <w:r>
+              <w:rPr>
+                <w:rFonts w:ascii="Calibri" w:hAnsi="Calibri"/>
+                <w:sz w:val="16"/>
+                <w:lang w:val="el-GR"/>
+              </w:rPr>
+              <w:t>Ε</w:t>
+            </w:r>
+            <w:r>
+              <w:rPr>
+                <w:rFonts w:ascii="Calibri" w:hAnsi="Calibri"/>
+                <w:sz w:val="16"/>
+                <w:lang w:val="el-GR"/>
+              </w:rPr>
+              <w:br/>
+              <w:t>Τσ</w:t>
+            </w:r>
+            <w:proofErr w:type="spellStart"/>
+            <w:r>
+              <w:rPr>
+                <w:rFonts w:ascii="Calibri" w:hAnsi="Calibri"/>
+                <w:sz w:val="16"/>
+                <w:lang w:val="el-GR"/>
+              </w:rPr>
+              <w:t>ιαράπας</w:t>
+            </w:r>
+            <w:proofErr w:type="spellEnd"/>
+            <w:r>
+              <w:rPr>
+                <w:rFonts w:ascii="Calibri" w:hAnsi="Calibri"/>
+                <w:sz w:val="16"/>
+                <w:lang w:val="el-GR"/>
+              </w:rPr>
+              <w:br/>
+              <w:t>204</w:t>
+            </w:r>
           </w:p>
         </w:tc>
         <w:tc>
@@ -7693,6 +7730,9 @@
           <w:p>
             <w:pPr>
               <w:cnfStyle w:val="000000100000" w:firstRow="0" w:lastRow="0" w:firstColumn="0" w:lastColumn="0" w:oddVBand="0" w:evenVBand="0" w:oddHBand="1" w:evenHBand="0" w:firstRowFirstColumn="0" w:firstRowLastColumn="0" w:lastRowFirstColumn="0" w:lastRowLastColumn="0"/>
+              <w:rPr>
+                <w:lang w:val="el-GR"/>
+              </w:rPr>
             </w:pPr>
           </w:p>
         </w:tc>

</xml_diff>